<commit_message>
docs(gestao): preenche o link do commit na retrospectiva da Entrega 1
</commit_message>
<xml_diff>
--- a/gestao/retrospectiva-e1.docx
+++ b/gestao/retrospectiva-e1.docx
@@ -4408,17 +4408,20 @@
         </w:rPr>
         <w:t xml:space="preserve">Link para o commit no repositó: </w:t>
       </w:r>
-      <w:r>
-        <w:rPr>
-          <w:rFonts w:ascii="Cambria" w:hAnsi="Cambria" w:asciiTheme="minorHAnsi" w:hAnsiTheme="minorHAnsi"/>
-          <w:b/>
-          <w:color w:val="auto"/>
-          <w:sz w:val="24"/>
-          <w:szCs w:val="24"/>
-          <w:lang w:val="pt-BR"/>
-        </w:rPr>
-        <w:t>(preencher após o commit)</w:t>
-      </w:r>
+      <w:hyperlink r:id="rIdCommit" w:history="1">
+        <w:r>
+          <w:rPr>
+            <w:rStyle w:val="Hyperlink"/>
+            <w:rFonts w:asciiTheme="minorHAnsi" w:hAnsiTheme="minorHAnsi"/>
+            <w:color w:val="0563C1"/>
+            <w:sz w:val="20"/>
+            <w:szCs w:val="20"/>
+            <w:u w:val="single"/>
+            <w:lang w:val="pt-BR"/>
+          </w:rPr>
+          <w:t>https://github.com/FCTE-Qualidade-de-Software-1/2026-2_T02_KATHERINE_JOHNSON/commit/0c32d6851398f715220681503df94aaa7c7e50e3</w:t>
+        </w:r>
+      </w:hyperlink>
     </w:p>
     <w:p>
       <w:pPr>

</xml_diff>